<commit_message>
WIP: Weekly tactical report redesign - remove Rapid7, remove Gate 1C
Disabled rapid7 and rapid7-scans for threat intel focus

Removed Gate 1C from weekly sequence (no environment data)

Next: Update report generator with new metrics
Co-authored-by: Cursor <cursoragent@cursor.com>
</commit_message>
<xml_diff>
--- a/CTI_Quarterly_Strategic_Brief_2026-05-26.docx
+++ b/CTI_Quarterly_Strategic_Brief_2026-05-26.docx
@@ -65,7 +65,7 @@
           <w:rFonts w:ascii="Arial" w:hAnsi="Arial"/>
           <w:sz w:val="21"/>
         </w:rPr>
-        <w:t>This quarter has seen a sustained and elevated threat environment for organizations in the technology, healthcare, pharmaceutical, life sciences, biotechnology, medical devices, research, education, and manufacturing sectors. The breach landscape is dominated by ransomware and extortion incidents, with initial access brokers facilitating attacks across industries. Nation-state actors from China, Russia, and North Korea remain highly active, targeting intellectual property, research data, and critical infrastructure, which poses significant risks to competitive advantage and operational continuity. The frequency and impact of breaches underscore the need for robust cyber resilience, especially as regulatory scrutiny and compliance obligations continue to intensify. Supply chain and third-party risks are also rising, with attackers increasingly leveraging vendor relationships to gain access to sensitive environments. Peer organizations are experiencing similar challenges, highlighting the importance of industry collaboration and benchmarking to inform investment and resource allocation decisions. The evolving threat landscape demands proactive measures to safeguard business operations, reputation, and regulatory compliance.</w:t>
+        <w:t>This quarter has seen a sustained increase in cyber threats targeting the technology, healthcare, pharmaceutical, life sciences, and manufacturing sectors. The breach landscape is dominated by ransomware and extortion incidents, with initial access brokers playing a pivotal role in facilitating attacks across industries. Nation state actors, particularly from China, Russia, and North Korea, continue to focus on intellectual property, research data, and operational disruption, posing significant risks to business continuity and competitive advantage. The frequency and impact of breaches underscore the urgent need for robust security controls, enhanced supply chain oversight, and proactive executive engagement. Regulatory scrutiny is intensifying, especially as data privacy and resilience requirements evolve. Peer organizations are experiencing similar threat patterns, with a notable rise in extortion and data exposure events. Strategic investment in security capabilities and third party risk management is critical to maintaining trust, regulatory compliance, and operational stability.</w:t>
       </w:r>
     </w:p>
     <w:p/>
@@ -218,7 +218,7 @@
                 <w:color w:val="F47F7D"/>
                 <w:sz w:val="16"/>
               </w:rPr>
-              <w:t>vs Q1: +27%</w:t>
+              <w:t>vs Q1: +40%</w:t>
             </w:r>
           </w:p>
         </w:tc>
@@ -520,7 +520,7 @@
                 <w:color w:val="F0F0F0"/>
                 <w:sz w:val="14"/>
               </w:rPr>
-              <w:t xml:space="preserve">Q1 2026: $95M </w:t>
+              <w:t xml:space="preserve">Q1 2026: $90M </w:t>
             </w:r>
             <w:r>
               <w:rPr>
@@ -528,7 +528,7 @@
                 <w:color w:val="E65100"/>
                 <w:sz w:val="14"/>
               </w:rPr>
-              <w:t>+26%</w:t>
+              <w:t>+33%</w:t>
             </w:r>
           </w:p>
         </w:tc>
@@ -591,7 +591,7 @@
                 <w:color w:val="F0F0F0"/>
                 <w:sz w:val="14"/>
               </w:rPr>
-              <w:t xml:space="preserve">Q1 2026: 11 </w:t>
+              <w:t xml:space="preserve">Q1 2026: 10 </w:t>
             </w:r>
             <w:r>
               <w:rPr>
@@ -599,7 +599,7 @@
                 <w:color w:val="E65100"/>
                 <w:sz w:val="14"/>
               </w:rPr>
-              <w:t>+27%</w:t>
+              <w:t>+40%</w:t>
             </w:r>
           </w:p>
         </w:tc>
@@ -633,7 +633,7 @@
                 <w:color w:val="F0F0F0"/>
                 <w:sz w:val="36"/>
               </w:rPr>
-              <w:t>32M</w:t>
+              <w:t>8M</w:t>
             </w:r>
           </w:p>
           <w:p>
@@ -662,7 +662,7 @@
                 <w:color w:val="F0F0F0"/>
                 <w:sz w:val="14"/>
               </w:rPr>
-              <w:t xml:space="preserve">Q1 2026: 25M </w:t>
+              <w:t xml:space="preserve">Q1 2026: 5M </w:t>
             </w:r>
             <w:r>
               <w:rPr>
@@ -670,7 +670,7 @@
                 <w:color w:val="E65100"/>
                 <w:sz w:val="14"/>
               </w:rPr>
-              <w:t>+28%</w:t>
+              <w:t>+60%</w:t>
             </w:r>
           </w:p>
         </w:tc>
@@ -885,7 +885,7 @@
                 <w:color w:val="666666"/>
                 <w:sz w:val="22"/>
               </w:rPr>
-              <w:t>11</w:t>
+              <w:t>10</w:t>
             </w:r>
           </w:p>
         </w:tc>
@@ -911,113 +911,7 @@
                 <w:color w:val="555555"/>
                 <w:sz w:val="20"/>
               </w:rPr>
-              <w:t>Multiple breaches involving initial access brokers resulted in ransomware deployment and extortion demands, impacting operations and exposing sensitive data.</w:t>
-            </w:r>
-          </w:p>
-        </w:tc>
-      </w:tr>
-      <w:tr>
-        <w:tc>
-          <w:tcPr>
-            <w:tcW w:type="dxa" w:w="2160"/>
-            <w:tcBorders>
-              <w:top w:val="single" w:sz="1" w:space="0" w:color="C0C0C0"/>
-              <w:bottom w:val="single" w:sz="1" w:space="0" w:color="C0C0C0"/>
-              <w:left w:val="single" w:sz="1" w:space="0" w:color="C0C0C0"/>
-              <w:right w:val="single" w:sz="1" w:space="0" w:color="C0C0C0"/>
-            </w:tcBorders>
-          </w:tcPr>
-          <w:p>
-            <w:pPr>
-              <w:jc w:val="left"/>
-            </w:pPr>
-            <w:r>
-              <w:rPr>
-                <w:rFonts w:ascii="Arial" w:hAnsi="Arial"/>
-                <w:b w:val="0"/>
-                <w:i w:val="0"/>
-                <w:sz w:val="22"/>
-              </w:rPr>
-              <w:t>Extortion</w:t>
-            </w:r>
-          </w:p>
-        </w:tc>
-        <w:tc>
-          <w:tcPr>
-            <w:tcW w:type="dxa" w:w="720"/>
-            <w:vAlign w:val="center"/>
-            <w:tcBorders>
-              <w:top w:val="single" w:sz="1" w:space="0" w:color="C0C0C0"/>
-              <w:bottom w:val="single" w:sz="1" w:space="0" w:color="C0C0C0"/>
-              <w:left w:val="single" w:sz="1" w:space="0" w:color="C0C0C0"/>
-              <w:right w:val="single" w:sz="1" w:space="0" w:color="C0C0C0"/>
-            </w:tcBorders>
-          </w:tcPr>
-          <w:p>
-            <w:pPr>
-              <w:jc w:val="center"/>
-            </w:pPr>
-            <w:r>
-              <w:rPr>
-                <w:rFonts w:ascii="Arial" w:hAnsi="Arial"/>
-                <w:b/>
-                <w:i w:val="0"/>
-                <w:sz w:val="22"/>
-              </w:rPr>
-              <w:t>6</w:t>
-            </w:r>
-          </w:p>
-        </w:tc>
-        <w:tc>
-          <w:tcPr>
-            <w:tcW w:type="dxa" w:w="720"/>
-            <w:vAlign w:val="center"/>
-            <w:tcBorders>
-              <w:top w:val="single" w:sz="1" w:space="0" w:color="C0C0C0"/>
-              <w:bottom w:val="single" w:sz="1" w:space="0" w:color="C0C0C0"/>
-              <w:left w:val="single" w:sz="1" w:space="0" w:color="C0C0C0"/>
-              <w:right w:val="single" w:sz="1" w:space="0" w:color="C0C0C0"/>
-            </w:tcBorders>
-          </w:tcPr>
-          <w:p>
-            <w:pPr>
-              <w:jc w:val="center"/>
-            </w:pPr>
-            <w:r>
-              <w:rPr>
-                <w:rFonts w:ascii="Arial" w:hAnsi="Arial"/>
-                <w:b w:val="0"/>
-                <w:i w:val="0"/>
-                <w:color w:val="666666"/>
-                <w:sz w:val="22"/>
-              </w:rPr>
-              <w:t>5</w:t>
-            </w:r>
-          </w:p>
-        </w:tc>
-        <w:tc>
-          <w:tcPr>
-            <w:tcW w:type="dxa" w:w="6480"/>
-            <w:tcBorders>
-              <w:top w:val="single" w:sz="1" w:space="0" w:color="C0C0C0"/>
-              <w:bottom w:val="single" w:sz="1" w:space="0" w:color="C0C0C0"/>
-              <w:left w:val="single" w:sz="1" w:space="0" w:color="C0C0C0"/>
-              <w:right w:val="single" w:sz="1" w:space="0" w:color="C0C0C0"/>
-            </w:tcBorders>
-          </w:tcPr>
-          <w:p>
-            <w:pPr>
-              <w:jc w:val="left"/>
-            </w:pPr>
-            <w:r>
-              <w:rPr>
-                <w:rFonts w:ascii="Arial" w:hAnsi="Arial"/>
-                <w:b w:val="0"/>
-                <w:i/>
-                <w:color w:val="555555"/>
-                <w:sz w:val="20"/>
-              </w:rPr>
-              <w:t>Database dumps and extortion threats were reported in several incidents, with attackers leveraging stolen credentials and threatening public disclosure.</w:t>
+              <w:t>Multiple breaches facilitated by initial access brokers resulted in extortion and large-scale data dumps impacting healthcare and manufacturing organizations.</w:t>
             </w:r>
           </w:p>
         </w:tc>
@@ -1123,7 +1017,113 @@
                 <w:color w:val="555555"/>
                 <w:sz w:val="20"/>
               </w:rPr>
-              <w:t>Third-party vendor compromise led to unauthorized access to manufacturing and healthcare systems, affecting downstream partners.</w:t>
+              <w:t>Third party software compromise led to unauthorized access to sensitive research data in a biotechnology firm.</w:t>
+            </w:r>
+          </w:p>
+        </w:tc>
+      </w:tr>
+      <w:tr>
+        <w:tc>
+          <w:tcPr>
+            <w:tcW w:type="dxa" w:w="2160"/>
+            <w:tcBorders>
+              <w:top w:val="single" w:sz="1" w:space="0" w:color="C0C0C0"/>
+              <w:bottom w:val="single" w:sz="1" w:space="0" w:color="C0C0C0"/>
+              <w:left w:val="single" w:sz="1" w:space="0" w:color="C0C0C0"/>
+              <w:right w:val="single" w:sz="1" w:space="0" w:color="C0C0C0"/>
+            </w:tcBorders>
+          </w:tcPr>
+          <w:p>
+            <w:pPr>
+              <w:jc w:val="left"/>
+            </w:pPr>
+            <w:r>
+              <w:rPr>
+                <w:rFonts w:ascii="Arial" w:hAnsi="Arial"/>
+                <w:b w:val="0"/>
+                <w:i w:val="0"/>
+                <w:sz w:val="22"/>
+              </w:rPr>
+              <w:t>Data Exposure</w:t>
+            </w:r>
+          </w:p>
+        </w:tc>
+        <w:tc>
+          <w:tcPr>
+            <w:tcW w:type="dxa" w:w="720"/>
+            <w:vAlign w:val="center"/>
+            <w:tcBorders>
+              <w:top w:val="single" w:sz="1" w:space="0" w:color="C0C0C0"/>
+              <w:bottom w:val="single" w:sz="1" w:space="0" w:color="C0C0C0"/>
+              <w:left w:val="single" w:sz="1" w:space="0" w:color="C0C0C0"/>
+              <w:right w:val="single" w:sz="1" w:space="0" w:color="C0C0C0"/>
+            </w:tcBorders>
+          </w:tcPr>
+          <w:p>
+            <w:pPr>
+              <w:jc w:val="center"/>
+            </w:pPr>
+            <w:r>
+              <w:rPr>
+                <w:rFonts w:ascii="Arial" w:hAnsi="Arial"/>
+                <w:b/>
+                <w:i w:val="0"/>
+                <w:sz w:val="22"/>
+              </w:rPr>
+              <w:t>2</w:t>
+            </w:r>
+          </w:p>
+        </w:tc>
+        <w:tc>
+          <w:tcPr>
+            <w:tcW w:type="dxa" w:w="720"/>
+            <w:vAlign w:val="center"/>
+            <w:tcBorders>
+              <w:top w:val="single" w:sz="1" w:space="0" w:color="C0C0C0"/>
+              <w:bottom w:val="single" w:sz="1" w:space="0" w:color="C0C0C0"/>
+              <w:left w:val="single" w:sz="1" w:space="0" w:color="C0C0C0"/>
+              <w:right w:val="single" w:sz="1" w:space="0" w:color="C0C0C0"/>
+            </w:tcBorders>
+          </w:tcPr>
+          <w:p>
+            <w:pPr>
+              <w:jc w:val="center"/>
+            </w:pPr>
+            <w:r>
+              <w:rPr>
+                <w:rFonts w:ascii="Arial" w:hAnsi="Arial"/>
+                <w:b w:val="0"/>
+                <w:i w:val="0"/>
+                <w:color w:val="666666"/>
+                <w:sz w:val="22"/>
+              </w:rPr>
+              <w:t>3</w:t>
+            </w:r>
+          </w:p>
+        </w:tc>
+        <w:tc>
+          <w:tcPr>
+            <w:tcW w:type="dxa" w:w="6480"/>
+            <w:tcBorders>
+              <w:top w:val="single" w:sz="1" w:space="0" w:color="C0C0C0"/>
+              <w:bottom w:val="single" w:sz="1" w:space="0" w:color="C0C0C0"/>
+              <w:left w:val="single" w:sz="1" w:space="0" w:color="C0C0C0"/>
+              <w:right w:val="single" w:sz="1" w:space="0" w:color="C0C0C0"/>
+            </w:tcBorders>
+          </w:tcPr>
+          <w:p>
+            <w:pPr>
+              <w:jc w:val="left"/>
+            </w:pPr>
+            <w:r>
+              <w:rPr>
+                <w:rFonts w:ascii="Arial" w:hAnsi="Arial"/>
+                <w:b w:val="0"/>
+                <w:i/>
+                <w:color w:val="555555"/>
+                <w:sz w:val="20"/>
+              </w:rPr>
+              <w:t>Database dump exposed millions of patient records in a healthcare provider, triggering regulatory notification requirements.</w:t>
             </w:r>
           </w:p>
         </w:tc>
@@ -1146,7 +1146,7 @@
           <w:b w:val="0"/>
           <w:sz w:val="20"/>
         </w:rPr>
-        <w:t>Exploitation of unpatched systems (37%), compromised credentials (29%), third-party/vendor access (21%), phishing and social engineering (13%)</w:t>
+        <w:t>Exploitation of unpatched systems (38 percent), compromised credentials (32 percent), third party/vendor compromise (18 percent), lack of multi factor authentication (12 percent)</w:t>
       </w:r>
     </w:p>
     <w:p>
@@ -1206,7 +1206,7 @@
           <w:b w:val="0"/>
           <w:sz w:val="21"/>
         </w:rPr>
-        <w:t>China continues to prioritize the acquisition of intellectual property and research data from the biotech and genomics sectors, viewing these as critical to national competitiveness and scientific advancement.</w:t>
+        <w:t>China maintains a strategic focus on acquiring intellectual property and research data from the biotech and genomics sectors, aligning with national priorities in healthcare innovation and economic competitiveness.</w:t>
       </w:r>
     </w:p>
     <w:p>
@@ -1230,7 +1230,7 @@
           <w:b w:val="0"/>
           <w:sz w:val="21"/>
         </w:rPr>
-        <w:t>This quarter, China-linked actors targeted pharmaceutical, healthcare, manufacturing, and technology organizations, focusing on research, supply chain, and operational data. Notable activity includes CASCADE PANDA and VAULT PANDA targeting pharmaceutical and academic sectors.</w:t>
+        <w:t>This quarter, China-linked actors were observed targeting pharmaceutical, healthcare, and manufacturing organizations, with attempts to access proprietary research and operational systems.</w:t>
       </w:r>
     </w:p>
     <w:p>
@@ -1254,7 +1254,7 @@
           <w:b w:val="0"/>
           <w:sz w:val="21"/>
         </w:rPr>
-        <w:t>The risk of intellectual property theft and disruption to R&amp;D pipelines is significant, potentially undermining competitive advantage and triggering regulatory investigations. Organizations must be vigilant in protecting proprietary data and research collaborations.</w:t>
+        <w:t>Business risks include loss of competitive advantage, regulatory exposure, and potential disruption to R&amp;D and manufacturing operations. Increased vigilance is required to protect sensitive data and maintain compliance.</w:t>
       </w:r>
     </w:p>
     <w:p>
@@ -1296,7 +1296,7 @@
           <w:b w:val="0"/>
           <w:sz w:val="21"/>
         </w:rPr>
-        <w:t>Russia maintains a robust ransomware and cybercrime ecosystem, with state-tolerated actors targeting critical infrastructure and commercial entities for financial gain and strategic leverage.</w:t>
+        <w:t>Russia continues to be a major driver of the ransomware ecosystem, leveraging criminal groups to target critical sectors for financial gain and operational disruption.</w:t>
       </w:r>
     </w:p>
     <w:p>
@@ -1320,7 +1320,7 @@
           <w:b w:val="0"/>
           <w:sz w:val="21"/>
         </w:rPr>
-        <w:t>Russian-linked actors such as TRAVELING SPIDER, BITWISE SPIDER, and ROYAL SPIDER were active across healthcare, manufacturing, and technology sectors, with a marked increase in ransomware and extortion campaigns.</w:t>
+        <w:t>Russian actors were active in ransomware and extortion campaigns against healthcare, pharmaceutical, and manufacturing entities, often exploiting initial access brokers and supply chain vulnerabilities.</w:t>
       </w:r>
     </w:p>
     <w:p>
@@ -1344,7 +1344,7 @@
           <w:b w:val="0"/>
           <w:sz w:val="21"/>
         </w:rPr>
-        <w:t>Operational disruptions, financial losses, and reputational damage are key risks. Regulatory bodies are increasingly scrutinizing ransomware preparedness and incident response, raising compliance stakes for affected organizations.</w:t>
+        <w:t>Organizations face heightened risk of business disruption, reputational damage, and regulatory penalties. Investment in ransomware resilience and incident response is essential.</w:t>
       </w:r>
     </w:p>
     <w:p>
@@ -1386,7 +1386,7 @@
           <w:b w:val="0"/>
           <w:sz w:val="21"/>
         </w:rPr>
-        <w:t>North Korea leverages cyber operations for both financial gain and intelligence collection, targeting technology, pharmaceutical, and manufacturing sectors to support national objectives.</w:t>
+        <w:t>North Korea pursues dual-purpose cyber operations, targeting financial assets and intellectual property to support state objectives and circumvent sanctions.</w:t>
       </w:r>
     </w:p>
     <w:p>
@@ -1410,7 +1410,7 @@
           <w:b w:val="0"/>
           <w:sz w:val="21"/>
         </w:rPr>
-        <w:t>North Korean actors such as FAMOUS CHOLLIMA and STARDUST CHOLLIMA targeted pharmaceutical, healthcare, and manufacturing organizations, focusing on both financial theft and data exfiltration.</w:t>
+        <w:t>North Korea-linked actors targeted technology and pharmaceutical sectors, seeking both financial gain and access to research data.</w:t>
       </w:r>
     </w:p>
     <w:p>
@@ -1434,7 +1434,7 @@
           <w:b w:val="0"/>
           <w:sz w:val="21"/>
         </w:rPr>
-        <w:t>Risks include loss of sensitive data, disruption to business operations, and increased regulatory attention. North Korean activity also underscores the need for enhanced monitoring of financial transactions and intellectual property protection.</w:t>
+        <w:t>Risks include financial loss, theft of proprietary information, and increased regulatory scrutiny. Enhanced monitoring and threat intelligence integration are recommended.</w:t>
       </w:r>
     </w:p>
     <w:p>
@@ -1475,7 +1475,7 @@
           <w:b w:val="0"/>
           <w:sz w:val="21"/>
         </w:rPr>
-        <w:t>We anticipate continued escalation in ransomware and extortion attacks, with nation-state actors intensifying their focus on research and intellectual property. Supply chain vulnerabilities will remain a key target, especially as organizations expand digital partnerships and vendor ecosystems.</w:t>
+        <w:t>We anticipate continued escalation in ransomware and extortion activity, with nation state actors expanding their targeting of research and manufacturing assets. Supply chain vulnerabilities will remain a primary concern as attackers seek indirect access through vendors and partners.</w:t>
       </w:r>
     </w:p>
     <w:p>
@@ -1499,7 +1499,7 @@
           <w:b w:val="0"/>
           <w:sz w:val="21"/>
         </w:rPr>
-        <w:t>Recommended initiatives include strengthening third-party risk management, enhancing incident response capabilities, investing in advanced threat detection, and increasing executive and board-level awareness of cyber risks.</w:t>
+        <w:t>Recommended initiatives include strengthening third party risk management, investing in advanced threat detection, expanding executive and board-level cyber awareness, and enhancing incident response capabilities.</w:t>
       </w:r>
     </w:p>
     <w:p>
@@ -1523,7 +1523,7 @@
           <w:b w:val="0"/>
           <w:sz w:val="21"/>
         </w:rPr>
-        <w:t>Monitor for new ransomware variants, increased activity from China and Russia-linked actors, and supply chain breaches involving critical vendors. Pay close attention to regulatory developments and peer organization incident trends.</w:t>
+        <w:t>Monitor for new ransomware variants, increased access broker activity, evolving regulatory requirements, and supply chain compromise trends.</w:t>
       </w:r>
     </w:p>
     <w:p>
@@ -1551,7 +1551,7 @@
           <w:b/>
           <w:sz w:val="21"/>
         </w:rPr>
-        <w:t>Executive AwarenessIncrease leadership engagement in cyber risk discussions and ensure regular briefings on evolving threat landscape.</w:t>
+        <w:t>Executive AwarenessIncrease executive and board-level engagement in cyber risk discussions, focusing on business impact and regulatory obligations.</w:t>
       </w:r>
     </w:p>
     <w:p>
@@ -1565,7 +1565,7 @@
           <w:b/>
           <w:sz w:val="21"/>
         </w:rPr>
-        <w:t>Vendor Risk ReviewConduct comprehensive reviews of third-party and supply chain risk, including contractual security obligations and incident response plans.</w:t>
+        <w:t>Vendor Risk ReviewConduct comprehensive reviews of third party and supply chain security controls, prioritizing critical vendors and partners.</w:t>
       </w:r>
     </w:p>
     <w:p>
@@ -1579,7 +1579,7 @@
           <w:b/>
           <w:sz w:val="21"/>
         </w:rPr>
-        <w:t>Manufacturing SecurityPrioritize investment in operational technology security controls and monitoring to prevent disruption and data loss.</w:t>
+        <w:t>Manufacturing SecurityInvest in operational technology security to protect manufacturing and research environments from ransomware and nation state threats.</w:t>
       </w:r>
     </w:p>
     <w:p>
@@ -1593,7 +1593,7 @@
           <w:b/>
           <w:sz w:val="21"/>
         </w:rPr>
-        <w:t>Incident ResponseEnhance incident response readiness with updated playbooks, tabletop exercises, and cross-functional coordination.</w:t>
+        <w:t>Incident ResponseEnhance incident response readiness, including tabletop exercises and rapid communication protocols for executive leadership.</w:t>
       </w:r>
     </w:p>
     <w:p>
@@ -1607,7 +1607,7 @@
           <w:b/>
           <w:sz w:val="21"/>
         </w:rPr>
-        <w:t>Board ReportingLeverage threat intelligence to inform board-level reporting and support compliance with emerging regulatory requirements.</w:t>
+        <w:t>Board ReportingLeverage threat intelligence for strategic board reporting, providing context on peer benchmarks and regulatory trends.</w:t>
       </w:r>
     </w:p>
     <w:p/>

</xml_diff>